<commit_message>
docs: alinea documentación con el MVP implementado
</commit_message>
<xml_diff>
--- a/docs/evidencias/clase-01/Evidencia_Clase_01_MVP_Equipo05.docx
+++ b/docs/evidencias/clase-01/Evidencia_Clase_01_MVP_Equipo05.docx
@@ -1369,7 +1369,7 @@
                 <w:color w:val="222222"/>
                 <w:rtl w:val="0"/>
               </w:rPr>
-              <w:t xml:space="preserve">Revisar y responder asignaciones, informar disponibilidad y registrar inicio y término.</w:t>
+              <w:t xml:space="preserve">Revisar y responder asignaciones, informar disponibilidad y registrar inicio y término, ya sea como titular o acompañante.</w:t>
             </w:r>
           </w:p>
         </w:tc>
@@ -1478,7 +1478,7 @@
                 <w:color w:val="222222"/>
                 <w:rtl w:val="0"/>
               </w:rPr>
-              <w:t xml:space="preserve">Consultar servicios guiados, responder y actualizar disponibilidad.</w:t>
+              <w:t xml:space="preserve">Consultar servicios guiados, responder, ejecutar el servicio asignado y actualizar disponibilidad como titular o acompañante.</w:t>
             </w:r>
           </w:p>
         </w:tc>
@@ -2285,7 +2285,7 @@
                 <w:rFonts w:ascii="Arial" w:cs="Arial" w:eastAsia="Arial" w:hAnsi="Arial"/>
                 <w:rtl w:val="0"/>
               </w:rPr>
-              <w:t xml:space="preserve">Confirmar o rechazar asignaciones y validar los campos obligatorios antes de guardar.</w:t>
+              <w:t xml:space="preserve">Confirmar o rechazar asignaciones y validar los campos obligatorios antes de guardar. Cada asignación tiene un titular y un acompañante opcional; ambos la ven, pero solo el titular responde y ejecuta.</w:t>
             </w:r>
           </w:p>
         </w:tc>
@@ -2711,7 +2711,7 @@
                 <w:rFonts w:ascii="Arial" w:cs="Arial" w:eastAsia="Arial" w:hAnsi="Arial"/>
                 <w:rtl w:val="0"/>
               </w:rPr>
-              <w:t xml:space="preserve">Conductor</w:t>
+              <w:t xml:space="preserve">Conductor y guía (titular)</w:t>
             </w:r>
           </w:p>
         </w:tc>
@@ -4008,7 +4008,7 @@
                 <w:rFonts w:ascii="Arial" w:cs="Arial" w:eastAsia="Arial" w:hAnsi="Arial"/>
                 <w:rtl w:val="0"/>
               </w:rPr>
-              <w:t xml:space="preserve">Conservar el inicio, término y respuestas de cada servicio.</w:t>
+              <w:t xml:space="preserve">Conservar el inicio, término y respuestas de cada servicio, con autor y fecha.</w:t>
             </w:r>
           </w:p>
         </w:tc>
@@ -4107,7 +4107,7 @@
                 <w:rFonts w:ascii="Arial" w:cs="Arial" w:eastAsia="Arial" w:hAnsi="Arial"/>
                 <w:rtl w:val="0"/>
               </w:rPr>
-              <w:t xml:space="preserve">Revisar respuestas y ejecución con datos de prueba.</w:t>
+              <w:t xml:space="preserve">Revisar respuestas y ejecución con datos de prueba; incluye equipo, ficha, reasignación y calificación.</w:t>
             </w:r>
           </w:p>
         </w:tc>
@@ -5703,7 +5703,7 @@
                 <w:rFonts w:ascii="Arial" w:cs="Arial" w:eastAsia="Arial" w:hAnsi="Arial"/>
                 <w:rtl w:val="0"/>
               </w:rPr>
-              <w:t xml:space="preserve">conductor</w:t>
+              <w:t xml:space="preserve">conductor o guía (titular)</w:t>
             </w:r>
           </w:p>
         </w:tc>
@@ -6715,7 +6715,7 @@
                 <w:rFonts w:ascii="Arial" w:cs="Arial" w:eastAsia="Arial" w:hAnsi="Arial"/>
                 <w:rtl w:val="0"/>
               </w:rPr>
-              <w:t xml:space="preserve">Registrar los hitos del conductor.</w:t>
+              <w:t xml:space="preserve">Registrar los hitos del titular (conductor o guía).</w:t>
             </w:r>
           </w:p>
         </w:tc>
@@ -6971,7 +6971,7 @@
               <w:br w:type="textWrapping"/>
               <w:t xml:space="preserve">[Estado actualizado]</w:t>
               <w:br w:type="textWrapping"/>
-              <w:t xml:space="preserve">Conductor: [Servicio confirmado] → [Check-in] → [Check-out]</w:t>
+              <w:t xml:space="preserve">Titular (conductor o guía): [Servicio confirmado] → [Check-in] → [Check-out]</w:t>
               <w:br w:type="textWrapping"/>
               <w:t xml:space="preserve">Desde Inicio → [Disponibilidad] / [Perfil] / [Historial]</w:t>
               <w:br w:type="textWrapping"/>
@@ -7331,7 +7331,7 @@
                 <w:rFonts w:ascii="Arial" w:cs="Arial" w:eastAsia="Arial" w:hAnsi="Arial"/>
                 <w:rtl w:val="0"/>
               </w:rPr>
-              <w:t xml:space="preserve">Ingreso por rol, servicios, respuestas, disponibilidad, perfil, check-in/check-out, historial y resumen con sincronización simulada.</w:t>
+              <w:t xml:space="preserve">Ingreso por rol, servicios, respuestas, disponibilidad, perfil, check-in/check-out, historial, resumen con sincronización simulada, reasignación, calificación, equipo y ficha.</w:t>
             </w:r>
             <w:r>
               <w:rPr>
@@ -7475,7 +7475,7 @@
         <w:rPr>
           <w:rtl w:val="0"/>
         </w:rPr>
-        <w:t xml:space="preserve">☐  El problema está redactado de forma clara y breve.</w:t>
+        <w:t xml:space="preserve">☑  El problema está redactado de forma clara y breve.</w:t>
       </w:r>
     </w:p>
     <w:p>
@@ -7487,7 +7487,7 @@
         <w:rPr>
           <w:rtl w:val="0"/>
         </w:rPr>
-        <w:t xml:space="preserve">☐  Se identificaron los usuarios reales de la aplicación.</w:t>
+        <w:t xml:space="preserve">☑  Se identificaron los usuarios reales de la aplicación.</w:t>
       </w:r>
     </w:p>
     <w:p>
@@ -7499,7 +7499,7 @@
         <w:rPr>
           <w:rtl w:val="0"/>
         </w:rPr>
-        <w:t xml:space="preserve">☐  Los requerimientos funcionales corresponden al caso entregado.</w:t>
+        <w:t xml:space="preserve">☑  Los requerimientos funcionales corresponden al caso entregado.</w:t>
       </w:r>
     </w:p>
     <w:p>
@@ -7511,7 +7511,7 @@
         <w:rPr>
           <w:rtl w:val="0"/>
         </w:rPr>
-        <w:t xml:space="preserve">☐  Las funcionalidades están priorizadas.</w:t>
+        <w:t xml:space="preserve">☑  Las funcionalidades están priorizadas.</w:t>
       </w:r>
     </w:p>
     <w:p>
@@ -7523,7 +7523,7 @@
         <w:rPr>
           <w:rtl w:val="0"/>
         </w:rPr>
-        <w:t xml:space="preserve">☐  El equipo definió un MVP alcanzable.</w:t>
+        <w:t xml:space="preserve">☑  El equipo definió un MVP alcanzable.</w:t>
       </w:r>
     </w:p>
     <w:p>
@@ -7535,7 +7535,7 @@
         <w:rPr>
           <w:rtl w:val="0"/>
         </w:rPr>
-        <w:t xml:space="preserve">☐  Se indicó explícitamente qué queda fuera del alcance.</w:t>
+        <w:t xml:space="preserve">☑  Se indicó explícitamente qué queda fuera del alcance.</w:t>
       </w:r>
     </w:p>
     <w:p>
@@ -7547,7 +7547,7 @@
         <w:rPr>
           <w:rtl w:val="0"/>
         </w:rPr>
-        <w:t xml:space="preserve">☐  Las historias de usuario representan funcionalidades del MVP.</w:t>
+        <w:t xml:space="preserve">☑  Las historias de usuario representan funcionalidades del MVP.</w:t>
       </w:r>
     </w:p>
     <w:p>
@@ -7559,7 +7559,7 @@
         <w:rPr>
           <w:rtl w:val="0"/>
         </w:rPr>
-        <w:t xml:space="preserve">☐  Las pantallas propuestas se relacionan con las funcionalidades.</w:t>
+        <w:t xml:space="preserve">☑  Las pantallas propuestas se relacionan con las funcionalidades.</w:t>
       </w:r>
     </w:p>
     <w:p>
@@ -7571,7 +7571,7 @@
         <w:rPr>
           <w:rtl w:val="0"/>
         </w:rPr>
-        <w:t xml:space="preserve">☐  Se dibujó un flujo inicial de navegación.</w:t>
+        <w:t xml:space="preserve">☑  Se dibujó un flujo inicial de navegación.</w:t>
       </w:r>
     </w:p>
     <w:p>
@@ -7583,7 +7583,7 @@
         <w:rPr>
           <w:rtl w:val="0"/>
         </w:rPr>
-        <w:t xml:space="preserve">☐  El documento fue revisado por todo el equipo.</w:t>
+        <w:t xml:space="preserve">☑  El documento fue revisado por todo el equipo.</w:t>
       </w:r>
     </w:p>
     <w:p>
@@ -8040,7 +8040,7 @@
                 <w:color w:val="222222"/>
                 <w:rtl w:val="0"/>
               </w:rPr>
-              <w:t xml:space="preserve">Construiremos Proyecto Lince, una app para que conductores y guías consulten sus servicios turísticos, confirmen o rechacen asignaciones y actualicen su disponibilidad. El conductor podrá registrar el inicio y término del servicio, y coordinación revisará respuestas e historial. Usaremos datos ficticios para demostrar el funcionamiento académico.</w:t>
+              <w:t xml:space="preserve">Construiremos Proyecto Lince, una app para que conductores y guías consulten sus servicios turísticos, confirmen o rechacen asignaciones y actualicen su disponibilidad. El titular, sea conductor o guía, podrá registrar el inicio y término del servicio; coordinación revisará respuestas, historial, equipo, reasignaciones y calificaciones. Usaremos datos ficticios para demostrar el funcionamiento académico.</w:t>
             </w:r>
             <w:r>
               <w:rPr>

</xml_diff>